<commit_message>
Finished Sprint Report 6 and added PDF version
</commit_message>
<xml_diff>
--- a/docs/srDesign_SprintReport6.docx
+++ b/docs/srDesign_SprintReport6.docx
@@ -82,7 +82,24 @@
         <w:t xml:space="preserve">This sprint focused </w:t>
       </w:r>
       <w:r>
-        <w:t>on finishing up testing and writing documentation. Through unit and load testing, bottlenecks and errors were found and corrected in the server. The STB client had a couple of features to finish up as well.</w:t>
+        <w:t>on finishing up testing and writing documentation. Through unit and load testing, bottlenecks and errors were found and corrected i</w:t>
+      </w:r>
+      <w:r>
+        <w:t>n the server. The STB client has</w:t>
+      </w:r>
+      <w:r>
+        <w:t xml:space="preserve"> a couple of features to finish up as well.</w:t>
+      </w:r>
+    </w:p>
+    <w:p>
+      <w:r>
+        <w:t>David and Kevin focused on the server portion while Marshall continued to work on the Virtual Set-Top Box.</w:t>
+      </w:r>
+      <w:r>
+        <w:t xml:space="preserve"> All three members were involved in documentation and creating the poste</w:t>
+      </w:r>
+      <w:r>
+        <w:t>r.</w:t>
       </w:r>
     </w:p>
     <w:p>
@@ -150,7 +167,7 @@
         </w:numPr>
       </w:pPr>
       <w:r>
-        <w:t>Convert to a service</w:t>
+        <w:t>Add better error checking and thread safety to DatabaseConnection</w:t>
       </w:r>
     </w:p>
     <w:p>
@@ -162,7 +179,7 @@
         </w:numPr>
       </w:pPr>
       <w:r>
-        <w:t>Add better error checking and thread safety to DatabaseConnection</w:t>
+        <w:t>Add logic to logger to write to service event log</w:t>
       </w:r>
     </w:p>
     <w:p>
@@ -174,7 +191,7 @@
         </w:numPr>
       </w:pPr>
       <w:r>
-        <w:t>Add logic to logger to write to service event log</w:t>
+        <w:t>Add mirroring to each player sees their side of the board on the bottom</w:t>
       </w:r>
     </w:p>
     <w:p>
@@ -186,18 +203,6 @@
         </w:numPr>
       </w:pPr>
       <w:r>
-        <w:t>Add mirroring to each player sees their side of the board on the bottom</w:t>
-      </w:r>
-    </w:p>
-    <w:p>
-      <w:pPr>
-        <w:pStyle w:val="ListParagraph"/>
-        <w:numPr>
-          <w:ilvl w:val="0"/>
-          <w:numId w:val="7"/>
-        </w:numPr>
-      </w:pPr>
-      <w:r>
         <w:t>Unit tests</w:t>
       </w:r>
     </w:p>
@@ -483,6 +488,7 @@
         </w:numPr>
       </w:pPr>
       <w:r>
+        <w:lastRenderedPageBreak/>
         <w:t>Change qDebug statements to qsqlquery statements</w:t>
       </w:r>
     </w:p>
@@ -507,7 +513,6 @@
         </w:numPr>
       </w:pPr>
       <w:r>
-        <w:lastRenderedPageBreak/>
         <w:t>Ensure project follows coding standards</w:t>
       </w:r>
     </w:p>
@@ -636,31 +641,91 @@
         </w:numPr>
       </w:pPr>
       <w:r>
-        <w:t>Appendix I: List of Figures</w:t>
-      </w:r>
-    </w:p>
-    <w:p>
-      <w:pPr>
-        <w:pStyle w:val="ListParagraph"/>
-        <w:numPr>
-          <w:ilvl w:val="1"/>
+        <w:t>Appendices</w:t>
+      </w:r>
+    </w:p>
+    <w:p>
+      <w:pPr>
+        <w:pStyle w:val="ListParagraph"/>
+        <w:numPr>
+          <w:ilvl w:val="0"/>
           <w:numId w:val="9"/>
         </w:numPr>
       </w:pPr>
       <w:r>
-        <w:t>Appendix II: Sprints</w:t>
-      </w:r>
-    </w:p>
-    <w:p>
-      <w:pPr>
-        <w:pStyle w:val="ListParagraph"/>
-        <w:numPr>
-          <w:ilvl w:val="1"/>
+        <w:t>Create working live demo for Design Fair</w:t>
+      </w:r>
+    </w:p>
+    <w:p>
+      <w:pPr>
+        <w:pStyle w:val="ListParagraph"/>
+        <w:numPr>
+          <w:ilvl w:val="0"/>
           <w:numId w:val="9"/>
         </w:numPr>
       </w:pPr>
       <w:r>
-        <w:t>Appendix III: Future Features</w:t>
+        <w:t>Client Presentation 3</w:t>
+      </w:r>
+    </w:p>
+    <w:p>
+      <w:pPr>
+        <w:pStyle w:val="ListParagraph"/>
+        <w:numPr>
+          <w:ilvl w:val="1"/>
+          <w:numId w:val="9"/>
+        </w:numPr>
+      </w:pPr>
+      <w:r>
+        <w:t>Create slides</w:t>
+      </w:r>
+    </w:p>
+    <w:p>
+      <w:pPr>
+        <w:pStyle w:val="ListParagraph"/>
+        <w:numPr>
+          <w:ilvl w:val="1"/>
+          <w:numId w:val="9"/>
+        </w:numPr>
+      </w:pPr>
+      <w:r>
+        <w:t>Make PDF version</w:t>
+      </w:r>
+    </w:p>
+    <w:p>
+      <w:pPr>
+        <w:pStyle w:val="ListParagraph"/>
+        <w:numPr>
+          <w:ilvl w:val="1"/>
+          <w:numId w:val="9"/>
+        </w:numPr>
+      </w:pPr>
+      <w:r>
+        <w:t>Practice presentation as group</w:t>
+      </w:r>
+    </w:p>
+    <w:p>
+      <w:pPr>
+        <w:pStyle w:val="ListParagraph"/>
+        <w:numPr>
+          <w:ilvl w:val="0"/>
+          <w:numId w:val="9"/>
+        </w:numPr>
+      </w:pPr>
+      <w:r>
+        <w:t>Ensure STBMF demo for senior design works with LAN setup</w:t>
+      </w:r>
+    </w:p>
+    <w:p>
+      <w:pPr>
+        <w:pStyle w:val="ListParagraph"/>
+        <w:numPr>
+          <w:ilvl w:val="0"/>
+          <w:numId w:val="9"/>
+        </w:numPr>
+      </w:pPr>
+      <w:r>
+        <w:t>Design Fair poster</w:t>
       </w:r>
     </w:p>
     <w:p>
@@ -672,6 +737,13 @@
       </w:r>
     </w:p>
     <w:p>
+      <w:pPr>
+        <w:pStyle w:val="ListParagraph"/>
+        <w:numPr>
+          <w:ilvl w:val="0"/>
+          <w:numId w:val="10"/>
+        </w:numPr>
+      </w:pPr>
       <w:r>
         <w:t xml:space="preserve">Microsoft Fakes </w:t>
       </w:r>
@@ -682,494 +754,265 @@
         <w:t xml:space="preserve"> </w:t>
       </w:r>
       <w:r>
-        <w:t>server unit tests were re-written using ‘shims’ and ‘fakes’, an easier way provide mock objects.</w:t>
-      </w:r>
-    </w:p>
-    <w:p>
-      <w:r>
-        <w:t>Poster for design fair</w:t>
-      </w:r>
-    </w:p>
-    <w:p>
-      <w:r>
-        <w:t>Converting project to be able to run as a windows service.</w:t>
-      </w:r>
-    </w:p>
-    <w:p/>
-    <w:p>
-      <w:pPr>
+        <w:t>S</w:t>
+      </w:r>
+      <w:r>
+        <w:t>erver unit tests were re-written using ‘shims’ and ‘fakes’, an easier way</w:t>
+      </w:r>
+      <w:r>
+        <w:t xml:space="preserve"> to</w:t>
+      </w:r>
+      <w:r>
+        <w:t xml:space="preserve"> provide mock objects</w:t>
+      </w:r>
+    </w:p>
+    <w:p>
+      <w:pPr>
+        <w:pStyle w:val="ListParagraph"/>
+        <w:numPr>
+          <w:ilvl w:val="0"/>
+          <w:numId w:val="10"/>
+        </w:numPr>
+      </w:pPr>
+      <w:r>
+        <w:t>David c</w:t>
+      </w:r>
+      <w:r>
+        <w:t>onver</w:t>
+      </w:r>
+      <w:r>
+        <w:t>t</w:t>
+      </w:r>
+      <w:r>
+        <w:t>ed the server</w:t>
+      </w:r>
+      <w:r>
+        <w:t xml:space="preserve"> </w:t>
+      </w:r>
+      <w:r>
+        <w:t>solution</w:t>
+      </w:r>
+      <w:r>
+        <w:t xml:space="preserve"> to be a</w:t>
+      </w:r>
+      <w:r>
+        <w:t>ble to run as a windows service</w:t>
+      </w:r>
+    </w:p>
+    <w:p>
+      <w:pPr>
+        <w:pStyle w:val="ListParagraph"/>
+        <w:numPr>
+          <w:ilvl w:val="0"/>
+          <w:numId w:val="10"/>
+        </w:numPr>
+      </w:pPr>
+      <w:r>
+        <w:t>David and Kevin worked on a Load Testing tool to quantify how well the server performed under real stress of many users.</w:t>
+      </w:r>
+      <w:r>
+        <w:t xml:space="preserve"> This provided valuable data and also helped identify bottlenecks within the software, which were then analyzed and corrected.</w:t>
+      </w:r>
+    </w:p>
+    <w:p>
+      <w:pPr>
+        <w:pStyle w:val="Heading1"/>
+      </w:pPr>
+      <w:r>
+        <w:t>Comments and R</w:t>
+      </w:r>
+      <w:r>
+        <w:t xml:space="preserve">eflection on </w:t>
+      </w:r>
+      <w:r>
+        <w:t>S</w:t>
+      </w:r>
+      <w:r>
+        <w:t>print</w:t>
+      </w:r>
+    </w:p>
+    <w:p>
+      <w:r>
+        <w:t>This sprint was mostly used to test our system</w:t>
+      </w:r>
+      <w:r>
+        <w:t xml:space="preserve">, create a poster and prepare for the Design fair.  We added more unit tests to the server and have more than 50% code coverage. We changed the way we were mocking objects by moving to a new framework </w:t>
+      </w:r>
+      <w:r>
+        <w:t>called</w:t>
+      </w:r>
+      <w:r>
+        <w:t xml:space="preserve"> Microsoft Fakes. This has allowed us to write our tests quick</w:t>
+      </w:r>
+      <w:r>
+        <w:t>er while making them easier to understand.</w:t>
+      </w:r>
+    </w:p>
+    <w:p>
+      <w:pPr>
+        <w:pStyle w:val="Heading1"/>
+      </w:pPr>
+      <w:r>
+        <w:lastRenderedPageBreak/>
+        <w:t xml:space="preserve">Work </w:t>
+      </w:r>
+      <w:r>
+        <w:t>Left Over</w:t>
+      </w:r>
+    </w:p>
+    <w:p>
+      <w:pPr>
+        <w:pStyle w:val="Heading2"/>
+      </w:pPr>
+      <w:r>
+        <w:t>Server</w:t>
+      </w:r>
+    </w:p>
+    <w:p>
+      <w:r>
+        <w:t xml:space="preserve">The server does not have a User Interface yet, but this feature was given low priority by the client. It will require more research, but it should not take long to create. </w:t>
+      </w:r>
+    </w:p>
+    <w:p>
+      <w:r>
+        <w:t>The code still uses a static connection string to talk to the database. This will be refa</w:t>
+      </w:r>
+      <w:r>
+        <w:t>ctored later to add a new one</w:t>
+      </w:r>
+      <w:r>
+        <w:t xml:space="preserve"> at runtime</w:t>
+      </w:r>
+      <w:r>
+        <w:t>.</w:t>
+      </w:r>
+    </w:p>
+    <w:p>
+      <w:r>
+        <w:t>Matchmaking will be re-</w:t>
+      </w:r>
+      <w:r>
+        <w:t>added</w:t>
+      </w:r>
+      <w:r>
+        <w:t xml:space="preserve"> after the design fair is complete.</w:t>
+      </w:r>
+    </w:p>
+    <w:p>
+      <w:pPr>
+        <w:pStyle w:val="Heading2"/>
+      </w:pPr>
+      <w:r>
+        <w:t>Checkers</w:t>
+      </w:r>
+    </w:p>
+    <w:p>
+      <w:r>
+        <w:t xml:space="preserve">The A.I. in checkers is still woefully inefficient and not scalable. </w:t>
+      </w:r>
+    </w:p>
+    <w:p>
+      <w:pPr>
+        <w:pStyle w:val="Heading2"/>
+      </w:pPr>
+      <w:r>
+        <w:t xml:space="preserve">Virtual </w:t>
+      </w:r>
+      <w:r>
+        <w:t>STB</w:t>
+      </w:r>
+    </w:p>
+    <w:p>
+      <w:r>
+        <w:t xml:space="preserve">The vSTB still needs to request resources from the server rather than using a static location on the C:\ drive. There is also a Tester card still in the backlog that is unfinished. </w:t>
+      </w:r>
+    </w:p>
+    <w:p>
+      <w:r>
+        <w:t>Unit testing will also occur in the next couple of weeks that will ensure that the STB will not crash from invalid states that could possibly occur.</w:t>
+      </w:r>
+    </w:p>
+    <w:p>
+      <w:pPr>
+        <w:pStyle w:val="Heading2"/>
+      </w:pPr>
+      <w:r>
+        <w:t>Project</w:t>
+      </w:r>
+    </w:p>
+    <w:p>
+      <w:r>
+        <w:t>Work with Brian to work on a way to deploy the system to other servers, including creating the d</w:t>
+      </w:r>
+      <w:r>
+        <w:t>atabase and filling it with initial</w:t>
+      </w:r>
+      <w:r>
+        <w:t xml:space="preserve"> data, loading plugins, and managing the database connection string.</w:t>
+      </w:r>
+    </w:p>
+    <w:p>
+      <w:pPr>
+        <w:pStyle w:val="Heading1"/>
+      </w:pPr>
+      <w:r>
+        <w:t>Research/Code Experiments</w:t>
+      </w:r>
+    </w:p>
+    <w:p>
+      <w:r>
         <w:rPr>
-          <w:strike/>
+          <w:rStyle w:val="Heading2Char"/>
         </w:rPr>
-      </w:pPr>
-      <w:r>
-        <w:rPr>
-          <w:strike/>
-        </w:rPr>
-        <w:t>On the server, David began unit testing using Moq and dependency injection, where dependencies such as using the database, communicating over sockets, and serializing messages, are injected into the code using interfaces. This allows Moq to fake implementation and for much less work to be done to unit test portions of code.</w:t>
-      </w:r>
-    </w:p>
-    <w:p>
-      <w:pPr>
-        <w:rPr>
-          <w:strike/>
-        </w:rPr>
-      </w:pPr>
-      <w:r>
-        <w:rPr>
-          <w:strike/>
-        </w:rPr>
-        <w:t xml:space="preserve">The logic for checkers was done much quicker than expected, and was also fully unit tested by Kevin, which was not planned. This did not mean that the plugin was error free, but it did provide a very good basis for testing other parts of the project. Once the main logic was done, Kevin decided to begin implementing the A.I. for checkers, and had a working code base in a couple of days. </w:t>
-      </w:r>
-      <w:r>
-        <w:rPr>
-          <w:strike/>
-        </w:rPr>
-        <w:t>He also made optimizations using Alpha Beta pruning, but there is still work to be done optimizing it further.</w:t>
-      </w:r>
-    </w:p>
-    <w:p>
-      <w:pPr>
-        <w:rPr>
-          <w:strike/>
-        </w:rPr>
-      </w:pPr>
-      <w:r>
-        <w:rPr>
-          <w:strike/>
-        </w:rPr>
-        <w:t xml:space="preserve">Not only did Marshall get updates to work on the virtual Set Top Box, he also updated the U.I. to more closely match what the actual Set Top Boxes look like. </w:t>
-      </w:r>
-    </w:p>
-    <w:p>
-      <w:pPr>
-        <w:pStyle w:val="Heading1"/>
-      </w:pPr>
-      <w:r>
-        <w:lastRenderedPageBreak/>
-        <w:t>Comments and R</w:t>
-      </w:r>
-      <w:r>
-        <w:t xml:space="preserve">eflection on </w:t>
-      </w:r>
-      <w:r>
-        <w:t>S</w:t>
-      </w:r>
-      <w:r>
-        <w:t>print</w:t>
-      </w:r>
-    </w:p>
-    <w:p>
-      <w:r>
-        <w:t>This sprint was mostly used to test our system</w:t>
-      </w:r>
-      <w:r>
-        <w:t>, create a poster and prepare for the Design fair.  We added more unit tests to the server and have more than 50% code coverage. We changed the way we were mocking objects by moving to a new framework provided by Microsoft: Microsoft Fakes. This has allowed us to write our tests quicker, easier, and in our opinion the test code is more clear and understandable.</w:t>
-      </w:r>
-    </w:p>
-    <w:p>
-      <w:pPr>
-        <w:pStyle w:val="Heading1"/>
-      </w:pPr>
-      <w:r>
-        <w:t>Work Carried to Next Sprint</w:t>
-      </w:r>
-    </w:p>
-    <w:p>
-      <w:r>
-        <w:t>Is there a next sprint?</w:t>
-      </w:r>
-    </w:p>
-    <w:p>
-      <w:pPr>
-        <w:pStyle w:val="Heading2"/>
-        <w:rPr>
-          <w:strike/>
-        </w:rPr>
-      </w:pPr>
-    </w:p>
-    <w:p>
-      <w:pPr>
-        <w:pStyle w:val="Heading2"/>
-        <w:rPr>
-          <w:strike/>
-        </w:rPr>
-      </w:pPr>
-      <w:r>
-        <w:rPr>
-          <w:strike/>
-        </w:rPr>
-        <w:t>Server</w:t>
-      </w:r>
-    </w:p>
-    <w:p>
-      <w:pPr>
-        <w:rPr>
-          <w:strike/>
-        </w:rPr>
-      </w:pPr>
-      <w:r>
-        <w:rPr>
-          <w:strike/>
-        </w:rPr>
-        <w:t>There needs to be many more unit tests on the server, but it is now set up to more easily create tests. There are also still a couple of classes without documentation, and that will also be pushed onto the next sprint. At this point though, there will not be any more major additions to this component.</w:t>
-      </w:r>
-    </w:p>
-    <w:p>
-      <w:pPr>
-        <w:pStyle w:val="Heading2"/>
-        <w:rPr>
-          <w:strike/>
-        </w:rPr>
-      </w:pPr>
-      <w:r>
-        <w:rPr>
-          <w:strike/>
-        </w:rPr>
-        <w:t>Checkers</w:t>
-      </w:r>
-    </w:p>
-    <w:p>
-      <w:pPr>
-        <w:rPr>
-          <w:strike/>
-        </w:rPr>
-      </w:pPr>
-      <w:r>
-        <w:rPr>
-          <w:strike/>
-        </w:rPr>
-        <w:t xml:space="preserve">There will be more testing and bug fixing in the next sprint for checkers. As bugs are fixed, there will </w:t>
-      </w:r>
-      <w:r>
-        <w:rPr>
-          <w:strike/>
-        </w:rPr>
-        <w:t>also</w:t>
-      </w:r>
-      <w:r>
-        <w:rPr>
-          <w:strike/>
-        </w:rPr>
-        <w:t xml:space="preserve"> be mor</w:t>
-      </w:r>
-      <w:r>
-        <w:rPr>
-          <w:strike/>
-        </w:rPr>
-        <w:t>e unit tests written. The AI portion also needs a few more optimizations.</w:t>
-      </w:r>
-      <w:r>
-        <w:rPr>
-          <w:strike/>
-        </w:rPr>
-        <w:t xml:space="preserve"> As of this writing</w:t>
-      </w:r>
-      <w:r>
-        <w:rPr>
-          <w:strike/>
-        </w:rPr>
-        <w:t>, there are 55</w:t>
-      </w:r>
-      <w:r>
-        <w:rPr>
-          <w:strike/>
-        </w:rPr>
-        <w:t xml:space="preserve"> unit tests backing checkers.</w:t>
-      </w:r>
-    </w:p>
-    <w:p>
-      <w:pPr>
-        <w:pStyle w:val="Heading2"/>
-        <w:rPr>
-          <w:strike/>
-        </w:rPr>
-      </w:pPr>
-      <w:r>
-        <w:rPr>
-          <w:strike/>
-        </w:rPr>
-        <w:t xml:space="preserve">Virtual </w:t>
-      </w:r>
-      <w:r>
-        <w:rPr>
-          <w:strike/>
-        </w:rPr>
-        <w:t>STB</w:t>
-      </w:r>
-    </w:p>
-    <w:p>
-      <w:pPr>
-        <w:rPr>
-          <w:strike/>
-        </w:rPr>
-      </w:pPr>
-      <w:r>
-        <w:rPr>
-          <w:strike/>
-        </w:rPr>
-        <w:t xml:space="preserve">There a couple of bugs that need to be taken care of yet, such as crashes when a second game is started after the first one finishes. </w:t>
-      </w:r>
-      <w:r>
-        <w:rPr>
-          <w:strike/>
-        </w:rPr>
-        <w:t xml:space="preserve">Also taking the existing vSTB database class and changing the connection and query statements to match the existing database schema. This will provide one central database for all errors, warnings, and issues generated by the vSTB. </w:t>
-      </w:r>
-      <w:r>
-        <w:rPr>
-          <w:strike/>
-        </w:rPr>
-        <w:t>The only major feature</w:t>
-      </w:r>
-      <w:r>
-        <w:rPr>
-          <w:strike/>
-        </w:rPr>
-        <w:t xml:space="preserve"> that still needs to be </w:t>
-      </w:r>
-      <w:r>
-        <w:rPr>
-          <w:strike/>
-        </w:rPr>
-        <w:t>implemented</w:t>
-      </w:r>
-      <w:r>
-        <w:rPr>
-          <w:strike/>
-        </w:rPr>
-        <w:t xml:space="preserve"> </w:t>
-      </w:r>
-      <w:r>
-        <w:rPr>
-          <w:strike/>
-        </w:rPr>
-        <w:t xml:space="preserve">is </w:t>
-      </w:r>
-      <w:r>
-        <w:rPr>
-          <w:strike/>
-        </w:rPr>
-        <w:t>using a remote control and arrow keys to move the selected area around the board. Once all the features are added, Marshall will begin to write some unit tests.</w:t>
-      </w:r>
-    </w:p>
-    <w:p>
-      <w:pPr>
-        <w:pStyle w:val="Heading1"/>
-      </w:pPr>
-      <w:r>
-        <w:t>Research/Code Experiments</w:t>
-      </w:r>
-    </w:p>
-    <w:p>
-      <w:pPr>
-        <w:pStyle w:val="Heading2"/>
-      </w:pPr>
-      <w:r>
-        <w:t>Server Unit Testing</w:t>
-      </w:r>
-    </w:p>
-    <w:p>
-      <w:r>
-        <w:t>Microsoft fakes – how to use</w:t>
-      </w:r>
-    </w:p>
-    <w:p>
-      <w:r>
-        <w:t>Chess AI interface – UCI: Universal chess interface.</w:t>
-      </w:r>
-    </w:p>
-    <w:p>
-      <w:r>
-        <w:t>Checkers AI – found an AI written in cpp</w:t>
-      </w:r>
-      <w:r>
-        <w:t>. Gives more ideas and inspiration on creating a better AI.</w:t>
+        <w:t>Microsoft Fakes</w:t>
+      </w:r>
+    </w:p>
+    <w:p>
+      <w:r>
+        <w:t>While looking for better unit testing lib</w:t>
+      </w:r>
+      <w:r>
+        <w:t>raries, David stumbled upon a</w:t>
       </w:r>
       <w:bookmarkStart w:id="0" w:name="_GoBack"/>
       <w:bookmarkEnd w:id="0"/>
-    </w:p>
-    <w:p>
-      <w:pPr>
+      <w:r>
+        <w:t xml:space="preserve"> relatively new technology from Microsoft. It required some tests to be re-written, but also provided valuable techniques for testing, such as swapping out runtime assemblies for static functions, so that custom functionality can be injected, even in .NET methods and classes.</w:t>
+      </w:r>
+    </w:p>
+    <w:p>
+      <w:r>
         <w:rPr>
-          <w:strike/>
+          <w:rStyle w:val="Heading2Char"/>
         </w:rPr>
-      </w:pPr>
-      <w:r>
-        <w:rPr>
-          <w:strike/>
-        </w:rPr>
-        <w:t xml:space="preserve">David researched Moq this sprint, which is a .NET mocking library for unit testing. Once Moq was finally integrated into the project (using NuGet), it became a challenge to write unit tests, since the database had to be connected and communications would fail when there was no </w:t>
-      </w:r>
-      <w:r>
-        <w:rPr>
-          <w:strike/>
-        </w:rPr>
-        <w:t xml:space="preserve">client to receive the messages </w:t>
-      </w:r>
-      <w:r>
-        <w:rPr>
-          <w:strike/>
-        </w:rPr>
+        <w:t>Artificial Intelligence Research</w:t>
+      </w:r>
+    </w:p>
+    <w:p>
+      <w:r>
+        <w:t>UCI: Universal chess interface.</w:t>
+      </w:r>
+    </w:p>
+    <w:p>
+      <w:r>
+        <w:t>Found an AI written in C++</w:t>
+      </w:r>
+      <w:r>
+        <w:t>. This will give</w:t>
+      </w:r>
+      <w:r>
+        <w:t xml:space="preserve"> us</w:t>
+      </w:r>
+      <w:r>
+        <w:t xml:space="preserve"> more ideas and inspiration on creating a better AI.</w:t>
+      </w:r>
+    </w:p>
+    <w:p>
+      <w:pPr>
+        <w:pStyle w:val="Heading1"/>
+      </w:pPr>
+      <w:r>
         <w:lastRenderedPageBreak/>
-        <w:t xml:space="preserve">being sent. More research into writing unit testable code produced the concept of dependency injection. The idea is that rather than using the actual class name of the code to send messages or use the database, one would use an interface with all the same methods on it, and then the class you would normally use implements that interface. At runtime, there is no difference, but when unit testing, you can use libraries like Moq to “mock” the implementation of the dependency. For instance, when calling to the database to add a state, one would just mock the IDatabase interface to return true, and when you want to get the state back, you mock IDatabase again to return some phony object that you would normally expect at runtime. </w:t>
-      </w:r>
-      <w:r>
-        <w:rPr>
-          <w:strike/>
-        </w:rPr>
-        <w:t>This allows for the unit tests to actually test the method, and not the dependencies that method uses.</w:t>
-      </w:r>
-    </w:p>
-    <w:p>
-      <w:pPr>
-        <w:pStyle w:val="Heading2"/>
-        <w:rPr>
-          <w:strike/>
-        </w:rPr>
-      </w:pPr>
-      <w:r>
-        <w:rPr>
-          <w:strike/>
-        </w:rPr>
-        <w:t>Virtual STB Refactoring</w:t>
-      </w:r>
-    </w:p>
-    <w:p>
-      <w:pPr>
-        <w:rPr>
-          <w:strike/>
-        </w:rPr>
-      </w:pPr>
-      <w:r>
-        <w:rPr>
-          <w:strike/>
-        </w:rPr>
-        <w:t xml:space="preserve">While the server was being developed, Marshall was forced to stub methods and hardcode data until the server could produce real results that could be tested against. After many months of doing this, some refactoring had to be done to use real data from the server. David helped out with this by moving some of the protocol definitions into separate files and grouping those files into common folders. This improved some of the organization of the vSTB, as well as speeding up compilation time. </w:t>
-      </w:r>
-    </w:p>
-    <w:p>
-      <w:pPr>
-        <w:pStyle w:val="Heading2"/>
-        <w:rPr>
-          <w:strike/>
-        </w:rPr>
-      </w:pPr>
-      <w:r>
-        <w:rPr>
-          <w:strike/>
-        </w:rPr>
-        <w:t>Virtual STB Drawing</w:t>
-      </w:r>
-    </w:p>
-    <w:p>
-      <w:pPr>
-        <w:rPr>
-          <w:strike/>
-        </w:rPr>
-      </w:pPr>
-      <w:r>
-        <w:rPr>
-          <w:strike/>
-        </w:rPr>
-        <w:t xml:space="preserve">To get checkers pieces to look like they are sitting on top of the board, Marshall had to look into drawing the images on top of each other, and doing so in an efficient way. </w:t>
-      </w:r>
-      <w:r>
-        <w:rPr>
-          <w:strike/>
-        </w:rPr>
-        <w:t>The end result was a very nice looking board where the piece images could be dynamically drawn on top of the tile images.</w:t>
-      </w:r>
-      <w:r>
-        <w:rPr>
-          <w:strike/>
-        </w:rPr>
-        <w:t xml:space="preserve"> Additionally he looked into QT style sheets to simplify palette logic on vSTB GUI Buttons.</w:t>
-      </w:r>
-    </w:p>
-    <w:p>
-      <w:pPr>
-        <w:pStyle w:val="Heading2"/>
-        <w:rPr>
-          <w:strike/>
-        </w:rPr>
-      </w:pPr>
-      <w:r>
-        <w:rPr>
-          <w:strike/>
-        </w:rPr>
-        <w:t>Virtual STB Unit Testing</w:t>
-      </w:r>
-    </w:p>
-    <w:p>
-      <w:pPr>
-        <w:rPr>
-          <w:strike/>
-        </w:rPr>
-      </w:pPr>
-      <w:r>
-        <w:rPr>
-          <w:strike/>
-        </w:rPr>
-        <w:t>Marshall has been conducting ongoing research into Qt’s unit testing libraries. Qt’s provided documentation is rather trivial and doesn’t offer much explanation into the finer details of the provided libraries. Due to this, he has been looking into alternative tools that may simplify unit testing</w:t>
-      </w:r>
-      <w:r>
-        <w:rPr>
-          <w:strike/>
-        </w:rPr>
-        <w:t>.</w:t>
-      </w:r>
-    </w:p>
-    <w:p>
-      <w:pPr>
-        <w:pStyle w:val="Heading2"/>
-        <w:rPr>
-          <w:strike/>
-        </w:rPr>
-      </w:pPr>
-      <w:r>
-        <w:rPr>
-          <w:strike/>
-        </w:rPr>
-        <w:t>Checkers A.I.</w:t>
-      </w:r>
-    </w:p>
-    <w:p>
-      <w:pPr>
-        <w:rPr>
-          <w:strike/>
-        </w:rPr>
-      </w:pPr>
-      <w:r>
-        <w:rPr>
-          <w:strike/>
-        </w:rPr>
-        <w:t xml:space="preserve">Kevin has taken the Artificial Intelligence class on campus, so he was the obvious candidate to write the checkers AI portion. </w:t>
-      </w:r>
-      <w:r>
-        <w:rPr>
-          <w:strike/>
-        </w:rPr>
-        <w:t xml:space="preserve">In only a couple of days he had a fully working analyzer that would look three moves ahead and decide which move to pick. This level of difficulty is fairly easy to beat, but any more moves ahead causes a drastic increase in computation. He then looked into more optimizations and remembered what he had learned about Alpha Beta pruning, and had </w:t>
-      </w:r>
-      <w:r>
-        <w:rPr>
-          <w:strike/>
-        </w:rPr>
-        <w:t>that</w:t>
-      </w:r>
-      <w:r>
-        <w:rPr>
-          <w:strike/>
-        </w:rPr>
-        <w:t xml:space="preserve"> integrated in a short time. It did not help as much as he had hoped, but after some careful analysis, we decided that we would try some more optimizations next sprint. </w:t>
-      </w:r>
-    </w:p>
-    <w:p>
-      <w:pPr>
-        <w:pStyle w:val="Heading1"/>
-      </w:pPr>
-      <w:r>
         <w:t>Meetings</w:t>
       </w:r>
     </w:p>
@@ -1726,6 +1569,92 @@
     </w:lvl>
   </w:abstractNum>
   <w:abstractNum w:abstractNumId="5">
+    <w:nsid w:val="33557714"/>
+    <w:multiLevelType w:val="multilevel"/>
+    <w:tmpl w:val="0409001F"/>
+    <w:lvl w:ilvl="0">
+      <w:start w:val="1"/>
+      <w:numFmt w:val="decimal"/>
+      <w:lvlText w:val="%1."/>
+      <w:lvlJc w:val="left"/>
+      <w:pPr>
+        <w:ind w:left="360" w:hanging="360"/>
+      </w:pPr>
+    </w:lvl>
+    <w:lvl w:ilvl="1">
+      <w:start w:val="1"/>
+      <w:numFmt w:val="decimal"/>
+      <w:lvlText w:val="%1.%2."/>
+      <w:lvlJc w:val="left"/>
+      <w:pPr>
+        <w:ind w:left="792" w:hanging="432"/>
+      </w:pPr>
+    </w:lvl>
+    <w:lvl w:ilvl="2">
+      <w:start w:val="1"/>
+      <w:numFmt w:val="decimal"/>
+      <w:lvlText w:val="%1.%2.%3."/>
+      <w:lvlJc w:val="left"/>
+      <w:pPr>
+        <w:ind w:left="1224" w:hanging="504"/>
+      </w:pPr>
+    </w:lvl>
+    <w:lvl w:ilvl="3">
+      <w:start w:val="1"/>
+      <w:numFmt w:val="decimal"/>
+      <w:lvlText w:val="%1.%2.%3.%4."/>
+      <w:lvlJc w:val="left"/>
+      <w:pPr>
+        <w:ind w:left="1728" w:hanging="648"/>
+      </w:pPr>
+    </w:lvl>
+    <w:lvl w:ilvl="4">
+      <w:start w:val="1"/>
+      <w:numFmt w:val="decimal"/>
+      <w:lvlText w:val="%1.%2.%3.%4.%5."/>
+      <w:lvlJc w:val="left"/>
+      <w:pPr>
+        <w:ind w:left="2232" w:hanging="792"/>
+      </w:pPr>
+    </w:lvl>
+    <w:lvl w:ilvl="5">
+      <w:start w:val="1"/>
+      <w:numFmt w:val="decimal"/>
+      <w:lvlText w:val="%1.%2.%3.%4.%5.%6."/>
+      <w:lvlJc w:val="left"/>
+      <w:pPr>
+        <w:ind w:left="2736" w:hanging="936"/>
+      </w:pPr>
+    </w:lvl>
+    <w:lvl w:ilvl="6">
+      <w:start w:val="1"/>
+      <w:numFmt w:val="decimal"/>
+      <w:lvlText w:val="%1.%2.%3.%4.%5.%6.%7."/>
+      <w:lvlJc w:val="left"/>
+      <w:pPr>
+        <w:ind w:left="3240" w:hanging="1080"/>
+      </w:pPr>
+    </w:lvl>
+    <w:lvl w:ilvl="7">
+      <w:start w:val="1"/>
+      <w:numFmt w:val="decimal"/>
+      <w:lvlText w:val="%1.%2.%3.%4.%5.%6.%7.%8."/>
+      <w:lvlJc w:val="left"/>
+      <w:pPr>
+        <w:ind w:left="3744" w:hanging="1224"/>
+      </w:pPr>
+    </w:lvl>
+    <w:lvl w:ilvl="8">
+      <w:start w:val="1"/>
+      <w:numFmt w:val="decimal"/>
+      <w:lvlText w:val="%1.%2.%3.%4.%5.%6.%7.%8.%9."/>
+      <w:lvlJc w:val="left"/>
+      <w:pPr>
+        <w:ind w:left="4320" w:hanging="1440"/>
+      </w:pPr>
+    </w:lvl>
+  </w:abstractNum>
+  <w:abstractNum w:abstractNumId="6">
     <w:nsid w:val="4F5668E3"/>
     <w:multiLevelType w:val="multilevel"/>
     <w:tmpl w:val="0409001F"/>
@@ -1811,7 +1740,7 @@
       </w:pPr>
     </w:lvl>
   </w:abstractNum>
-  <w:abstractNum w:abstractNumId="6">
+  <w:abstractNum w:abstractNumId="7">
     <w:nsid w:val="505507A0"/>
     <w:multiLevelType w:val="multilevel"/>
     <w:tmpl w:val="0409001F"/>
@@ -1897,7 +1826,7 @@
       </w:pPr>
     </w:lvl>
   </w:abstractNum>
-  <w:abstractNum w:abstractNumId="7">
+  <w:abstractNum w:abstractNumId="8">
     <w:nsid w:val="5C434879"/>
     <w:multiLevelType w:val="multilevel"/>
     <w:tmpl w:val="0409001F"/>
@@ -1983,7 +1912,7 @@
       </w:pPr>
     </w:lvl>
   </w:abstractNum>
-  <w:abstractNum w:abstractNumId="8">
+  <w:abstractNum w:abstractNumId="9">
     <w:nsid w:val="7E1A6CFB"/>
     <w:multiLevelType w:val="multilevel"/>
     <w:tmpl w:val="0409001F"/>
@@ -2070,7 +1999,7 @@
     </w:lvl>
   </w:abstractNum>
   <w:num w:numId="1">
-    <w:abstractNumId w:val="7"/>
+    <w:abstractNumId w:val="8"/>
   </w:num>
   <w:num w:numId="2">
     <w:abstractNumId w:val="0"/>
@@ -2079,7 +2008,7 @@
     <w:abstractNumId w:val="2"/>
   </w:num>
   <w:num w:numId="4">
-    <w:abstractNumId w:val="5"/>
+    <w:abstractNumId w:val="6"/>
   </w:num>
   <w:num w:numId="5">
     <w:abstractNumId w:val="1"/>
@@ -2091,10 +2020,13 @@
     <w:abstractNumId w:val="4"/>
   </w:num>
   <w:num w:numId="8">
-    <w:abstractNumId w:val="8"/>
+    <w:abstractNumId w:val="9"/>
   </w:num>
   <w:num w:numId="9">
-    <w:abstractNumId w:val="6"/>
+    <w:abstractNumId w:val="7"/>
+  </w:num>
+  <w:num w:numId="10">
+    <w:abstractNumId w:val="5"/>
   </w:num>
 </w:numbering>
 </file>
@@ -3191,7 +3123,7 @@
 </file>
 
 <file path=customXml/itemProps1.xml><?xml version="1.0" encoding="utf-8"?>
-<ds:datastoreItem xmlns:ds="http://schemas.openxmlformats.org/officeDocument/2006/customXml" ds:itemID="{B289FD3C-16D1-4B19-9979-7B7BF33078C0}">
+<ds:datastoreItem xmlns:ds="http://schemas.openxmlformats.org/officeDocument/2006/customXml" ds:itemID="{068F504C-CBBD-4721-B40F-AF76B2DA2453}">
   <ds:schemaRefs>
     <ds:schemaRef ds:uri="http://schemas.openxmlformats.org/officeDocument/2006/bibliography"/>
   </ds:schemaRefs>

</xml_diff>